<commit_message>
Présentation complète : photos des composants sur les diapos correspondantes
Photos d'exemples (wiki ArduPilot CC BY-SA 3.0, Raspberry Pi Ltd CC BY-SA 4.0)
avec crédits ; diapo galerie des principaux composants ; vues du drone
limitées à la couverture, au principe, aux parties annotées et à la conclusion.

Co-Authored-By: Claude Opus 5.5 <noreply@anthropic.com>
Claude-Session: https://claude.ai/code/session_01JGe5HuVVxU57xxDiTHq6Ld
</commit_message>
<xml_diff>
--- a/pitch/script_oral_presentation_complete.docx
+++ b/pitch/script_oral_presentation_complete.docx
@@ -7,7 +7,7 @@
         <w:pStyle w:val="Title"/>
       </w:pPr>
       <w:r>
-        <w:t>Pitch Sentinelle Aérienne : script oral (23 diapos)</w:t>
+        <w:t>Pitch Sentinelle Aérienne : script oral (24 diapos)</w:t>
       </w:r>
     </w:p>
     <w:p>
@@ -30,7 +30,7 @@
     <w:p>
       <w:r>
         <w:rPr/>
-        <w:t>Durée indicative : environ 21 minutes.</w:t>
+        <w:t>Durée indicative : environ 22 minutes.</w:t>
       </w:r>
     </w:p>
     <w:tbl>
@@ -975,6 +975,80 @@
               <w:rPr>
                 <w:sz w:val="19"/>
               </w:rPr>
+              <w:t>Les principaux composants</w:t>
+            </w:r>
+          </w:p>
+        </w:tc>
+        <w:tc>
+          <w:tcPr>
+            <w:tcW w:type="dxa" w:w="2493"/>
+          </w:tcPr>
+          <w:p>
+            <w:r>
+              <w:rPr>
+                <w:sz w:val="19"/>
+              </w:rPr>
+            </w:r>
+            <w:r>
+              <w:rPr>
+                <w:sz w:val="19"/>
+              </w:rPr>
+              <w:t>Israel AWADE</w:t>
+            </w:r>
+          </w:p>
+        </w:tc>
+        <w:tc>
+          <w:tcPr>
+            <w:tcW w:type="dxa" w:w="2493"/>
+          </w:tcPr>
+          <w:p>
+            <w:r>
+              <w:rPr>
+                <w:sz w:val="19"/>
+              </w:rPr>
+            </w:r>
+            <w:r>
+              <w:rPr>
+                <w:sz w:val="19"/>
+              </w:rPr>
+              <w:t>60 s</w:t>
+            </w:r>
+          </w:p>
+        </w:tc>
+      </w:tr>
+      <w:tr>
+        <w:tc>
+          <w:tcPr>
+            <w:tcW w:type="dxa" w:w="2493"/>
+          </w:tcPr>
+          <w:p>
+            <w:r>
+              <w:rPr>
+                <w:sz w:val="19"/>
+              </w:rPr>
+            </w:r>
+            <w:r>
+              <w:rPr>
+                <w:sz w:val="19"/>
+              </w:rPr>
+              <w:t>13</w:t>
+            </w:r>
+          </w:p>
+        </w:tc>
+        <w:tc>
+          <w:tcPr>
+            <w:tcW w:type="dxa" w:w="2493"/>
+          </w:tcPr>
+          <w:p>
+            <w:r>
+              <w:rPr>
+                <w:sz w:val="19"/>
+              </w:rPr>
+            </w:r>
+            <w:r>
+              <w:rPr>
+                <w:sz w:val="19"/>
+              </w:rPr>
               <w:t>Le module d'intelligence artificielle</w:t>
             </w:r>
           </w:p>
@@ -1031,7 +1105,7 @@
               <w:rPr>
                 <w:sz w:val="19"/>
               </w:rPr>
-              <w:t>13</w:t>
+              <w:t>14</w:t>
             </w:r>
           </w:p>
         </w:tc>
@@ -1105,7 +1179,7 @@
               <w:rPr>
                 <w:sz w:val="19"/>
               </w:rPr>
-              <w:t>14</w:t>
+              <w:t>15</w:t>
             </w:r>
           </w:p>
         </w:tc>
@@ -1179,7 +1253,7 @@
               <w:rPr>
                 <w:sz w:val="19"/>
               </w:rPr>
-              <w:t>15</w:t>
+              <w:t>16</w:t>
             </w:r>
           </w:p>
         </w:tc>
@@ -1253,7 +1327,7 @@
               <w:rPr>
                 <w:sz w:val="19"/>
               </w:rPr>
-              <w:t>16</w:t>
+              <w:t>17</w:t>
             </w:r>
           </w:p>
         </w:tc>
@@ -1327,7 +1401,7 @@
               <w:rPr>
                 <w:sz w:val="19"/>
               </w:rPr>
-              <w:t>17</w:t>
+              <w:t>18</w:t>
             </w:r>
           </w:p>
         </w:tc>
@@ -1401,7 +1475,7 @@
               <w:rPr>
                 <w:sz w:val="19"/>
               </w:rPr>
-              <w:t>18</w:t>
+              <w:t>19</w:t>
             </w:r>
           </w:p>
         </w:tc>
@@ -1475,7 +1549,7 @@
               <w:rPr>
                 <w:sz w:val="19"/>
               </w:rPr>
-              <w:t>19</w:t>
+              <w:t>20</w:t>
             </w:r>
           </w:p>
         </w:tc>
@@ -1549,7 +1623,7 @@
               <w:rPr>
                 <w:sz w:val="19"/>
               </w:rPr>
-              <w:t>20</w:t>
+              <w:t>21</w:t>
             </w:r>
           </w:p>
         </w:tc>
@@ -1623,7 +1697,7 @@
               <w:rPr>
                 <w:sz w:val="19"/>
               </w:rPr>
-              <w:t>21</w:t>
+              <w:t>22</w:t>
             </w:r>
           </w:p>
         </w:tc>
@@ -1697,7 +1771,7 @@
               <w:rPr>
                 <w:sz w:val="19"/>
               </w:rPr>
-              <w:t>22</w:t>
+              <w:t>23</w:t>
             </w:r>
           </w:p>
         </w:tc>
@@ -1771,7 +1845,7 @@
               <w:rPr>
                 <w:sz w:val="19"/>
               </w:rPr>
-              <w:t>23</w:t>
+              <w:t>24</w:t>
             </w:r>
           </w:p>
         </w:tc>
@@ -2109,7 +2183,7 @@
     <w:p>
       <w:r>
         <w:rPr/>
-        <w:t>Nous prévoyons des alimentations séparées : une pour les radios, et une dédiée au Raspberry Pi, pour qu'aucune ne perturbe l'autre. Roger va vous présenter le module IA.</w:t>
+        <w:t>Nous prévoyons des alimentations séparées : une pour les radios, et une dédiée au Raspberry Pi, pour qu'aucune ne perturbe l'autre.</w:t>
       </w:r>
     </w:p>
     <w:p>
@@ -2117,7 +2191,27 @@
         <w:pStyle w:val="Heading1"/>
       </w:pPr>
       <w:r>
-        <w:t>12. Le module d'intelligence artificielle (Roger KAINWANG)</w:t>
+        <w:t>12. Les principaux composants (Israel AWADE)</w:t>
+      </w:r>
+    </w:p>
+    <w:p>
+      <w:r>
+        <w:rPr/>
+        <w:t>Voici à quoi ressemblent les principaux composants. Pour l'énergie : la batterie lithium-polymère, le module de puissance, les variateurs et les moteurs sans balais. Pour le pilotage : le contrôleur de vol à STM32H743, le module GNSS avec son compas, le tube de Pitot, la radio longue portée et la radiocommande. Et pour la mission : le Raspberry Pi 5, sa carte d'accélération Hailo-8, et la caméra.</w:t>
+      </w:r>
+    </w:p>
+    <w:p>
+      <w:r>
+        <w:rPr/>
+        <w:t>Ce sont des composants standards, faciles à trouver et à remplacer. Roger va vous présenter le module d'intelligence artificielle.</w:t>
+      </w:r>
+    </w:p>
+    <w:p>
+      <w:pPr>
+        <w:pStyle w:val="Heading1"/>
+      </w:pPr>
+      <w:r>
+        <w:t>13. Le module d'intelligence artificielle (Roger KAINWANG)</w:t>
       </w:r>
     </w:p>
     <w:p>
@@ -2143,7 +2237,7 @@
         <w:pStyle w:val="Heading1"/>
       </w:pPr>
       <w:r>
-        <w:t>13. Données et fiabilité de l'IA (Roger KAINWANG)</w:t>
+        <w:t>14. Données et fiabilité de l'IA (Roger KAINWANG)</w:t>
       </w:r>
     </w:p>
     <w:p>
@@ -2163,7 +2257,7 @@
         <w:pStyle w:val="Heading1"/>
       </w:pPr>
       <w:r>
-        <w:t>14. Station sol et back-end (Angelo LOGO ADANTO)</w:t>
+        <w:t>15. Station sol et back-end (Angelo LOGO ADANTO)</w:t>
       </w:r>
     </w:p>
     <w:p>
@@ -2183,7 +2277,7 @@
         <w:pStyle w:val="Heading1"/>
       </w:pPr>
       <w:r>
-        <w:t>15. Trois liaisons indépendantes (Makafui de MEDEIROS)</w:t>
+        <w:t>16. Trois liaisons indépendantes (Makafui de MEDEIROS)</w:t>
       </w:r>
     </w:p>
     <w:p>
@@ -2203,7 +2297,7 @@
         <w:pStyle w:val="Heading1"/>
       </w:pPr>
       <w:r>
-        <w:t>16. Les avantages (Israel AWADE)</w:t>
+        <w:t>17. Les avantages (Israel AWADE)</w:t>
       </w:r>
     </w:p>
     <w:p>
@@ -2217,7 +2311,7 @@
         <w:pStyle w:val="Heading1"/>
       </w:pPr>
       <w:r>
-        <w:t>17. Les risques et nos réponses (Israel AWADE puis Makafui de MEDEIROS)</w:t>
+        <w:t>18. Les risques et nos réponses (Israel AWADE puis Makafui de MEDEIROS)</w:t>
       </w:r>
     </w:p>
     <w:p>
@@ -2243,7 +2337,7 @@
         <w:pStyle w:val="Heading1"/>
       </w:pPr>
       <w:r>
-        <w:t>18. La réglementation (Cédric KODJOVI)</w:t>
+        <w:t>19. La réglementation (Cédric KODJOVI)</w:t>
       </w:r>
     </w:p>
     <w:p>
@@ -2269,7 +2363,7 @@
         <w:pStyle w:val="Heading1"/>
       </w:pPr>
       <w:r>
-        <w:t>19. La sécurité (Makafui de MEDEIROS)</w:t>
+        <w:t>20. La sécurité (Makafui de MEDEIROS)</w:t>
       </w:r>
     </w:p>
     <w:p>
@@ -2295,7 +2389,7 @@
         <w:pStyle w:val="Heading1"/>
       </w:pPr>
       <w:r>
-        <w:t>20. Domaines d'application (Cédric KODJOVI)</w:t>
+        <w:t>21. Domaines d'application (Cédric KODJOVI)</w:t>
       </w:r>
     </w:p>
     <w:p>
@@ -2309,7 +2403,7 @@
         <w:pStyle w:val="Heading1"/>
       </w:pPr>
       <w:r>
-        <w:t>21. Calendrier (Cédric KODJOVI)</w:t>
+        <w:t>22. Calendrier (Cédric KODJOVI)</w:t>
       </w:r>
     </w:p>
     <w:p>
@@ -2323,7 +2417,7 @@
         <w:pStyle w:val="Heading1"/>
       </w:pPr>
       <w:r>
-        <w:t>22. Budget prévisionnel (Israel AWADE)</w:t>
+        <w:t>23. Budget prévisionnel (Israel AWADE)</w:t>
       </w:r>
     </w:p>
     <w:p>
@@ -2337,7 +2431,7 @@
         <w:pStyle w:val="Heading1"/>
       </w:pPr>
       <w:r>
-        <w:t>23. En résumé (Israel AWADE)</w:t>
+        <w:t>24. En résumé (Israel AWADE)</w:t>
       </w:r>
     </w:p>
     <w:p>

</xml_diff>